<commit_message>
Comité CGN: redacción integrada en el protocolo v2.0, citas verificadas y diapositivas de exposición
Co-Authored-By: Claude Opus 5.5 <noreply@anthropic.com>
Claude-Session: https://claude.ai/code/session_01A2a3kkCw22mKtZ4h9yLDKX
</commit_message>
<xml_diff>
--- a/comite_etica_CGN/Carta_respuesta_punto_por_punto.docx
+++ b/comite_etica_CGN/Carta_respuesta_punto_por_punto.docx
@@ -13,7 +13,7 @@
           <w:sz w:val="22"/>
           <w:szCs w:val="22"/>
         </w:rPr>
-        <w:t xml:space="preserve">Barranquilla, 17 de octubre de 2026</w:t>
+        <w:t xml:space="preserve">Barranquilla, 19 de octubre de 2026</w:t>
       </w:r>
     </w:p>
     <w:p>
@@ -855,7 +855,7 @@
                 <w:sz w:val="18"/>
                 <w:szCs w:val="18"/>
               </w:rPr>
-              <w:t xml:space="preserve">p. 6; num. 2.1.5, pp. 18–19; p. 36; p. 45; refs. 51–53</w:t>
+              <w:t xml:space="preserve">p. 6; num. 2.1.5, p. 18; p. 35; p. 44; refs. 51–53</w:t>
             </w:r>
           </w:p>
         </w:tc>
@@ -980,7 +980,7 @@
                 <w:sz w:val="18"/>
                 <w:szCs w:val="18"/>
               </w:rPr>
-              <w:t xml:space="preserve">Num. 3.9, pp. 40–42; p. 24; p. 25</w:t>
+              <w:t xml:space="preserve">Num. 3.9, pp. 40–41; p. 24; p. 25</w:t>
             </w:r>
           </w:p>
         </w:tc>
@@ -1105,7 +1105,7 @@
                 <w:sz w:val="18"/>
                 <w:szCs w:val="18"/>
               </w:rPr>
-              <w:t xml:space="preserve">Num. 3.9.1, pp. 43–45; p. 31</w:t>
+              <w:t xml:space="preserve">Num. 3.9.1, pp. 42–43; p. 31</w:t>
             </w:r>
           </w:p>
         </w:tc>
@@ -1230,7 +1230,7 @@
                 <w:sz w:val="18"/>
                 <w:szCs w:val="18"/>
               </w:rPr>
-              <w:t xml:space="preserve">Num. 3.9.1 g), p. 44; num. 3.9.2, p. 45; p. 46</w:t>
+              <w:t xml:space="preserve">Num. 3.9.1, p. 43; num. 3.9.2, p. 44; p. 45</w:t>
             </w:r>
           </w:p>
         </w:tc>
@@ -1355,7 +1355,7 @@
                 <w:sz w:val="18"/>
                 <w:szCs w:val="18"/>
               </w:rPr>
-              <w:t xml:space="preserve">Num. 3.5, pp. 32–33; Tabla 3, pp. 38–39; p. 43</w:t>
+              <w:t xml:space="preserve">Num. 3.5, pp. 32–33; Tabla 3, p. 38; p. 41</w:t>
             </w:r>
           </w:p>
         </w:tc>
@@ -2393,7 +2393,7 @@
                 <w:sz w:val="18"/>
                 <w:szCs w:val="18"/>
               </w:rPr>
-              <w:t xml:space="preserve">Países Bajos</w:t>
+              <w:t xml:space="preserve">Países Bajos, Amphia Hospital (Breda)</w:t>
             </w:r>
           </w:p>
         </w:tc>
@@ -2423,7 +2423,7 @@
                 <w:sz w:val="18"/>
                 <w:szCs w:val="18"/>
               </w:rPr>
-              <w:t xml:space="preserve">Serie retrospectiva; 329 procedimientos consecutivos en TJ</w:t>
+              <w:t xml:space="preserve">Serie retrospectiva; 329 procedimientos consecutivos en TJ, 2001–2022</w:t>
             </w:r>
           </w:p>
         </w:tc>
@@ -3203,7 +3203,7 @@
                 <w:sz w:val="18"/>
                 <w:szCs w:val="18"/>
               </w:rPr>
-              <w:t xml:space="preserve">Antecedente nacional con la misma definición poblacional</w:t>
+              <w:t xml:space="preserve">Antecedente nacional con la misma definición poblacional (resumen de congreso)</w:t>
             </w:r>
           </w:p>
         </w:tc>
@@ -3255,7 +3255,7 @@
           <w:sz w:val="22"/>
           <w:szCs w:val="22"/>
         </w:rPr>
-        <w:t xml:space="preserve">Nuevo apartado «Justificación de la población de estudio», numeral 1.2, </w:t>
+        <w:t xml:space="preserve">Fundamentación de la delimitación de la población, numeral 1.2, </w:t>
       </w:r>
       <w:r>
         <w:rPr>
@@ -3683,17 +3683,17 @@
           <w:sz w:val="22"/>
           <w:szCs w:val="22"/>
         </w:rPr>
-        <w:t xml:space="preserve"> (num. 3.9.1 c, </w:t>
-      </w:r>
-      <w:r>
-        <w:rPr>
-          <w:rFonts w:ascii="Calibri" w:cs="Calibri" w:eastAsia="Calibri" w:hAnsi="Calibri"/>
-          <w:b/>
-          <w:bCs/>
-          <w:sz w:val="22"/>
-          <w:szCs w:val="22"/>
-        </w:rPr>
-        <w:t xml:space="preserve">p. 44</w:t>
+        <w:t xml:space="preserve"> (num. 3.9.1, </w:t>
+      </w:r>
+      <w:r>
+        <w:rPr>
+          <w:rFonts w:ascii="Calibri" w:cs="Calibri" w:eastAsia="Calibri" w:hAnsi="Calibri"/>
+          <w:b/>
+          <w:bCs/>
+          <w:sz w:val="22"/>
+          <w:szCs w:val="22"/>
+        </w:rPr>
+        <w:t xml:space="preserve">p. 43</w:t>
       </w:r>
       <w:r>
         <w:rPr>
@@ -3820,7 +3820,7 @@
           <w:sz w:val="22"/>
           <w:szCs w:val="22"/>
         </w:rPr>
-        <w:t xml:space="preserve">En marzo de 2026</w:t>
+        <w:t xml:space="preserve">El 20 de marzo de 2026</w:t>
       </w:r>
       <w:r>
         <w:rPr>
@@ -3997,17 +3997,17 @@
           <w:sz w:val="22"/>
           <w:szCs w:val="22"/>
         </w:rPr>
-        <w:t xml:space="preserve">Numeral 2.1.5, «Contexto religioso y temporal del periodo de estudio», </w:t>
-      </w:r>
-      <w:r>
-        <w:rPr>
-          <w:rFonts w:ascii="Calibri" w:cs="Calibri" w:eastAsia="Calibri" w:hAnsi="Calibri"/>
-          <w:b/>
-          <w:bCs/>
-          <w:sz w:val="22"/>
-          <w:szCs w:val="22"/>
-        </w:rPr>
-        <w:t xml:space="preserve">pp. 18–19</w:t>
+        <w:t xml:space="preserve">Numeral 2.1.5, contexto religioso y temporal del periodo de estudio, </w:t>
+      </w:r>
+      <w:r>
+        <w:rPr>
+          <w:rFonts w:ascii="Calibri" w:cs="Calibri" w:eastAsia="Calibri" w:hAnsi="Calibri"/>
+          <w:b/>
+          <w:bCs/>
+          <w:sz w:val="22"/>
+          <w:szCs w:val="22"/>
+        </w:rPr>
+        <w:t xml:space="preserve">p. 18</w:t>
       </w:r>
       <w:r>
         <w:rPr>
@@ -4044,25 +4044,25 @@
           <w:sz w:val="22"/>
           <w:szCs w:val="22"/>
         </w:rPr>
-        <w:t xml:space="preserve">p. 36</w:t>
-      </w:r>
-      <w:r>
-        <w:rPr>
-          <w:rFonts w:ascii="Calibri" w:cs="Calibri" w:eastAsia="Calibri" w:hAnsi="Calibri"/>
-          <w:sz w:val="22"/>
-          <w:szCs w:val="22"/>
-        </w:rPr>
-        <w:t xml:space="preserve">. Numeral 3.9.2 d), interpretación en contexto, </w:t>
-      </w:r>
-      <w:r>
-        <w:rPr>
-          <w:rFonts w:ascii="Calibri" w:cs="Calibri" w:eastAsia="Calibri" w:hAnsi="Calibri"/>
-          <w:b/>
-          <w:bCs/>
-          <w:sz w:val="22"/>
-          <w:szCs w:val="22"/>
-        </w:rPr>
-        <w:t xml:space="preserve">p. 45</w:t>
+        <w:t xml:space="preserve">p. 35</w:t>
+      </w:r>
+      <w:r>
+        <w:rPr>
+          <w:rFonts w:ascii="Calibri" w:cs="Calibri" w:eastAsia="Calibri" w:hAnsi="Calibri"/>
+          <w:sz w:val="22"/>
+          <w:szCs w:val="22"/>
+        </w:rPr>
+        <w:t xml:space="preserve">. Numeral 3.9.2, interpretación en contexto, </w:t>
+      </w:r>
+      <w:r>
+        <w:rPr>
+          <w:rFonts w:ascii="Calibri" w:cs="Calibri" w:eastAsia="Calibri" w:hAnsi="Calibri"/>
+          <w:b/>
+          <w:bCs/>
+          <w:sz w:val="22"/>
+          <w:szCs w:val="22"/>
+        </w:rPr>
+        <w:t xml:space="preserve">p. 44</w:t>
       </w:r>
       <w:r>
         <w:rPr>
@@ -4089,17 +4089,17 @@
           <w:sz w:val="22"/>
           <w:szCs w:val="22"/>
         </w:rPr>
-        <w:t xml:space="preserve">Referencias 51 a 53 (comunicado oficial, AABB y prensa), </w:t>
-      </w:r>
-      <w:r>
-        <w:rPr>
-          <w:rFonts w:ascii="Calibri" w:cs="Calibri" w:eastAsia="Calibri" w:hAnsi="Calibri"/>
-          <w:b/>
-          <w:bCs/>
-          <w:sz w:val="22"/>
-          <w:szCs w:val="22"/>
-        </w:rPr>
-        <w:t xml:space="preserve">p. 53</w:t>
+        <w:t xml:space="preserve">Referencias 51 a 53 (comunicado oficial, AABB y Associated Press), </w:t>
+      </w:r>
+      <w:r>
+        <w:rPr>
+          <w:rFonts w:ascii="Calibri" w:cs="Calibri" w:eastAsia="Calibri" w:hAnsi="Calibri"/>
+          <w:b/>
+          <w:bCs/>
+          <w:sz w:val="22"/>
+          <w:szCs w:val="22"/>
+        </w:rPr>
+        <w:t xml:space="preserve">p. 52</w:t>
       </w:r>
       <w:r>
         <w:rPr>
@@ -4409,7 +4409,7 @@
                 <w:sz w:val="18"/>
                 <w:szCs w:val="18"/>
               </w:rPr>
-              <w:t xml:space="preserve">Num. 3.1 y 3.9 a), p. 40</w:t>
+              <w:t xml:space="preserve">Num. 3.1 y 3.9, p. 40</w:t>
             </w:r>
           </w:p>
         </w:tc>
@@ -4504,7 +4504,7 @@
                 <w:sz w:val="18"/>
                 <w:szCs w:val="18"/>
               </w:rPr>
-              <w:t xml:space="preserve">Num. 3.9 b), p. 40; 3.9.1, pp. 43–44</w:t>
+              <w:t xml:space="preserve">Num. 3.9, p. 40; 3.9.1, pp. 42–43</w:t>
             </w:r>
           </w:p>
         </w:tc>
@@ -4599,7 +4599,7 @@
                 <w:sz w:val="18"/>
                 <w:szCs w:val="18"/>
               </w:rPr>
-              <w:t xml:space="preserve">Num. 3.9 c), p. 41</w:t>
+              <w:t xml:space="preserve">Num. 3.9, p. 40</w:t>
             </w:r>
           </w:p>
         </w:tc>
@@ -4694,7 +4694,7 @@
                 <w:sz w:val="18"/>
                 <w:szCs w:val="18"/>
               </w:rPr>
-              <w:t xml:space="preserve">Num. 3.9 d), p. 41; 3.9.1</w:t>
+              <w:t xml:space="preserve">Num. 3.9, p. 40; 3.9.1</w:t>
             </w:r>
           </w:p>
         </w:tc>
@@ -4958,17 +4958,17 @@
           <w:sz w:val="22"/>
           <w:szCs w:val="22"/>
         </w:rPr>
-        <w:t xml:space="preserve">«Justificación de la clasificación del riesgo», numeral 3.9, </w:t>
-      </w:r>
-      <w:r>
-        <w:rPr>
-          <w:rFonts w:ascii="Calibri" w:cs="Calibri" w:eastAsia="Calibri" w:hAnsi="Calibri"/>
-          <w:b/>
-          <w:bCs/>
-          <w:sz w:val="22"/>
-          <w:szCs w:val="22"/>
-        </w:rPr>
-        <w:t xml:space="preserve">pp. 40–41</w:t>
+        <w:t xml:space="preserve">Fundamentación de la clasificación del riesgo, numeral 3.9, </w:t>
+      </w:r>
+      <w:r>
+        <w:rPr>
+          <w:rFonts w:ascii="Calibri" w:cs="Calibri" w:eastAsia="Calibri" w:hAnsi="Calibri"/>
+          <w:b/>
+          <w:bCs/>
+          <w:sz w:val="22"/>
+          <w:szCs w:val="22"/>
+        </w:rPr>
+        <w:t xml:space="preserve">p. 40</w:t>
       </w:r>
       <w:r>
         <w:rPr>
@@ -4995,17 +4995,17 @@
           <w:sz w:val="22"/>
           <w:szCs w:val="22"/>
         </w:rPr>
-        <w:t xml:space="preserve">«Fundamentación de la solicitud de dispensa», numeral 3.9, </w:t>
-      </w:r>
-      <w:r>
-        <w:rPr>
-          <w:rFonts w:ascii="Calibri" w:cs="Calibri" w:eastAsia="Calibri" w:hAnsi="Calibri"/>
-          <w:b/>
-          <w:bCs/>
-          <w:sz w:val="22"/>
-          <w:szCs w:val="22"/>
-        </w:rPr>
-        <w:t xml:space="preserve">p. 42</w:t>
+        <w:t xml:space="preserve">Fundamentación de la solicitud de dispensa, numeral 3.9, </w:t>
+      </w:r>
+      <w:r>
+        <w:rPr>
+          <w:rFonts w:ascii="Calibri" w:cs="Calibri" w:eastAsia="Calibri" w:hAnsi="Calibri"/>
+          <w:b/>
+          <w:bCs/>
+          <w:sz w:val="22"/>
+          <w:szCs w:val="22"/>
+        </w:rPr>
+        <w:t xml:space="preserve">p. 41</w:t>
       </w:r>
       <w:r>
         <w:rPr>
@@ -5147,7 +5147,7 @@
           <w:sz w:val="22"/>
           <w:szCs w:val="22"/>
         </w:rPr>
-        <w:t xml:space="preserve">3.9.1, «Plan de protección de datos personales y sensibles» (pp. 43–45)</w:t>
+        <w:t xml:space="preserve">3.9.1, «Plan de protección de datos personales y sensibles» (pp. 42–43)</w:t>
       </w:r>
       <w:r>
         <w:rPr>
@@ -5502,7 +5502,7 @@
                 <w:sz w:val="18"/>
                 <w:szCs w:val="18"/>
               </w:rPr>
-              <w:t xml:space="preserve">REDCap institucional (perfiles, auditoría, autenticación) o archivo cifrado AES-256 en servidor institucional, con respaldos cifrados. Conservación de cinco años y eliminación con acta.</w:t>
+              <w:t xml:space="preserve">REDCap institucional (perfiles, auditoría, autenticación) o archivo cifrado en servidor institucional, con respaldos cifrados. Conservación de cinco años y eliminación con acta.</w:t>
             </w:r>
           </w:p>
         </w:tc>
@@ -5881,7 +5881,7 @@
           <w:sz w:val="22"/>
           <w:szCs w:val="22"/>
         </w:rPr>
-        <w:t xml:space="preserve">3.9.2, «Medidas para una interpretación y publicación responsables» (p. 45)</w:t>
+        <w:t xml:space="preserve">3.9.2, «Interpretación y publicación de los resultados» (p. 44)</w:t>
       </w:r>
       <w:r>
         <w:rPr>
@@ -6063,17 +6063,17 @@
           <w:sz w:val="22"/>
           <w:szCs w:val="22"/>
         </w:rPr>
-        <w:t xml:space="preserve"> reglas del numeral 3.9.1 g) (</w:t>
-      </w:r>
-      <w:r>
-        <w:rPr>
-          <w:rFonts w:ascii="Calibri" w:cs="Calibri" w:eastAsia="Calibri" w:hAnsi="Calibri"/>
-          <w:b/>
-          <w:bCs/>
-          <w:sz w:val="22"/>
-          <w:szCs w:val="22"/>
-        </w:rPr>
-        <w:t xml:space="preserve">p. 44</w:t>
+        <w:t xml:space="preserve"> reglas de prevención de la identificación indirecta del numeral 3.9.1 (</w:t>
+      </w:r>
+      <w:r>
+        <w:rPr>
+          <w:rFonts w:ascii="Calibri" w:cs="Calibri" w:eastAsia="Calibri" w:hAnsi="Calibri"/>
+          <w:b/>
+          <w:bCs/>
+          <w:sz w:val="22"/>
+          <w:szCs w:val="22"/>
+        </w:rPr>
+        <w:t xml:space="preserve">p. 43</w:t>
       </w:r>
       <w:r>
         <w:rPr>
@@ -6091,7 +6091,7 @@
           <w:sz w:val="22"/>
           <w:szCs w:val="22"/>
         </w:rPr>
-        <w:t xml:space="preserve">p. 46</w:t>
+        <w:t xml:space="preserve">p. 45</w:t>
       </w:r>
       <w:r>
         <w:rPr>
@@ -6619,7 +6619,7 @@
           <w:sz w:val="22"/>
           <w:szCs w:val="22"/>
         </w:rPr>
-        <w:t xml:space="preserve">pp. 38–39</w:t>
+        <w:t xml:space="preserve">p. 38</w:t>
       </w:r>
       <w:r>
         <w:rPr>
@@ -6637,7 +6637,7 @@
           <w:sz w:val="22"/>
           <w:szCs w:val="22"/>
         </w:rPr>
-        <w:t xml:space="preserve">p. 43</w:t>
+        <w:t xml:space="preserve">p. 41</w:t>
       </w:r>
       <w:r>
         <w:rPr>
@@ -7393,7 +7393,7 @@
           <w:sz w:val="22"/>
           <w:szCs w:val="22"/>
         </w:rPr>
-        <w:t xml:space="preserve">Pattakos G, et al. Outcome of patients who refuse transfusion after cardiac surgery: a natural experiment with severe blood conservation. Arch Intern Med. 2012;172(15):1154-60.</w:t>
+        <w:t xml:space="preserve">Associated Press. Jehovah’s Witnesses ease policy on transfusions, allowing storage and use of one’s own blood. 20 de marzo de 2026.</w:t>
       </w:r>
     </w:p>
     <w:p>
@@ -7412,7 +7412,7 @@
           <w:sz w:val="22"/>
           <w:szCs w:val="22"/>
         </w:rPr>
-        <w:t xml:space="preserve">Nakano HRY, et al. Coronary artery bypass grafting in Jehovah’s Witness patients: a retrospective propensity matched cohort study. Braz J Anesthesiol. 2026. doi:10.1016/j.bjane.2026.844765.</w:t>
+        <w:t xml:space="preserve">Pattakos G, et al. Outcome of patients who refuse transfusion after cardiac surgery: a natural experiment with severe blood conservation. Arch Intern Med. 2012;172(15):1154-60.</w:t>
       </w:r>
     </w:p>
     <w:p>
@@ -7431,7 +7431,7 @@
           <w:sz w:val="22"/>
           <w:szCs w:val="22"/>
         </w:rPr>
-        <w:t xml:space="preserve">Hartrumpf M, et al. Everyday cardiac surgery in Jehovah’s Witnesses of typically advanced age: clinical outcome and matched comparison. J Clin Med. 2023;12(15):5110.</w:t>
+        <w:t xml:space="preserve">Nakano HRY, et al. Coronary artery bypass grafting in Jehovah’s Witness patients: a retrospective propensity matched cohort study. Braz J Anesthesiol. 2026. doi:10.1016/j.bjane.2026.844765.</w:t>
       </w:r>
     </w:p>
     <w:p>
@@ -7450,7 +7450,7 @@
           <w:sz w:val="22"/>
           <w:szCs w:val="22"/>
         </w:rPr>
-        <w:t xml:space="preserve">Valle FH, et al. Cardiac surgery in Jehovah’s Witness patients: experience of a Brazilian tertiary hospital. Braz J Cardiovasc Surg. 2017;32(5):372-7.</w:t>
+        <w:t xml:space="preserve">Hartrumpf M, et al. Everyday cardiac surgery in Jehovah’s Witnesses of typically advanced age: clinical outcome and matched comparison. J Clin Med. 2023;12(15):5110.</w:t>
       </w:r>
     </w:p>
     <w:p>
@@ -7469,7 +7469,7 @@
           <w:sz w:val="22"/>
           <w:szCs w:val="22"/>
         </w:rPr>
-        <w:t xml:space="preserve">Tanaka A, et al. Cardiovascular surgery in Jehovah’s Witness patients: the role of preoperative optimization. J Thorac Cardiovasc Surg. 2015;150(4):976-83.</w:t>
+        <w:t xml:space="preserve">Valle FH, et al. Cardiac surgery in Jehovah’s Witness patients: experience of a Brazilian tertiary hospital. Braz J Cardiovasc Surg. 2017;32(5):372-7.</w:t>
       </w:r>
     </w:p>
     <w:p>
@@ -7488,7 +7488,7 @@
           <w:sz w:val="22"/>
           <w:szCs w:val="22"/>
         </w:rPr>
-        <w:t xml:space="preserve">Marinakis S, et al. Outcomes from cardiac surgery in Jehovah’s Witness patients: experience over twenty-one years. J Cardiothorac Surg. 2016. doi:10.1186/s13019-016-0455-6.</w:t>
+        <w:t xml:space="preserve">Tanaka A, et al. Cardiovascular surgery in Jehovah’s Witness patients: the role of preoperative optimization. J Thorac Cardiovasc Surg. 2015;150(4):976-83.</w:t>
       </w:r>
     </w:p>
     <w:p>
@@ -7507,7 +7507,26 @@
           <w:sz w:val="22"/>
           <w:szCs w:val="22"/>
         </w:rPr>
-        <w:t xml:space="preserve">Gemelli M, et al. Curr Probl Cardiol. 2024;49(1):102078. Vitolo M, et al. Curr Probl Cardiol. 2023;48(9):101789. Langstraat M, et al. J Cardiothorac Vasc Anesth. 2023;37(9):1601-5. Helwani MA, et al. J Cardiothorac Vasc Anesth. 2023;37(4):513-8. Vaislic CD, et al. J Cardiothorac Surg. 2012;7:95. Yamabe T, et al. J Card Surg. 2025:9190618. Montes Villalobos L, et al. Póster, Sociedad Colombiana de Cardiología.</w:t>
+        <w:t xml:space="preserve">Marinakis S, et al. Outcomes from cardiac surgery in Jehovah’s Witness patients: experience over twenty-one years. J Cardiothorac Surg. 2016. doi:10.1186/s13019-016-0455-6.</w:t>
+      </w:r>
+    </w:p>
+    <w:p>
+      <w:pPr>
+        <w:pStyle w:val="ListParagraph"/>
+        <w:numPr>
+          <w:ilvl w:val="0"/>
+          <w:numId w:val="6"/>
+        </w:numPr>
+        <w:spacing w:after="80" w:line="276"/>
+        <w:jc w:val="both"/>
+      </w:pPr>
+      <w:r>
+        <w:rPr>
+          <w:rFonts w:ascii="Calibri" w:cs="Calibri" w:eastAsia="Calibri" w:hAnsi="Calibri"/>
+          <w:sz w:val="22"/>
+          <w:szCs w:val="22"/>
+        </w:rPr>
+        <w:t xml:space="preserve">Gemelli M, et al. Curr Probl Cardiol. 2024;49(1 Pt B):102078. Müller H, et al. Ann Thorac Surg. 2020;109(2):526-33. Jassar AS, et al. Ann Thorac Surg. 2012;93(1):19-25. Vitolo M, et al. Curr Probl Cardiol. 2023;48(9):101789. Langstraat M, et al. J Cardiothorac Vasc Anesth. 2023;37(9):1601-5. Helwani MA, et al. J Cardiothorac Vasc Anesth. 2023;37(4):513-8. Vaislic CD, et al. J Cardiothorac Surg. 2012;7:95. Yamabe T, et al. J Card Surg. 2025;2025:9190618. Montes Villalobos L, et al. Póster, Sociedad Colombiana de Cardiología.</w:t>
       </w:r>
     </w:p>
     <w:sectPr>

</xml_diff>

<commit_message>
Comité CGN: carta final en PDF (23-10-2026) y diapositivas según la nueva carta
Co-Authored-By: Claude Opus 5.5 <noreply@anthropic.com>
Claude-Session: https://claude.ai/code/session_01A2a3kkCw22mKtZ4h9yLDKX
</commit_message>
<xml_diff>
--- a/comite_etica_CGN/Carta_respuesta_punto_por_punto.docx
+++ b/comite_etica_CGN/Carta_respuesta_punto_por_punto.docx
@@ -7,7 +7,7 @@
         <w:spacing w:after="240" w:line="276" w:lineRule="auto"/>
       </w:pPr>
       <w:r>
-        <w:t>Barranquilla, 19 de octubre de 2026</w:t>
+        <w:t>Barranquilla, 23 de octubre de 2026</w:t>
       </w:r>
     </w:p>
     <w:p>
@@ -127,15 +127,7 @@
         <w:jc w:val="both"/>
       </w:pPr>
       <w:r>
-        <w:t xml:space="preserve">Agradecemos al Comité y al Dr. Anderson Díaz Pérez la revisión rigurosa del anteproyecto. Valoramos especialmente que el concepto reconozca la pertinencia científica de la investigación y que no identifique un impedimento bioético absoluto para estudiar esta población. Hemos analizado cada observación con el mismo rigor y presentamos a continuación nuestra respuesta, junto con la versión 2.0 del protocolo, en la que todos los ajustes aparecen resaltados en amarillo. </w:t>
-      </w:r>
-      <w:r>
-        <w:rPr>
-          <w:b/>
-          <w:bCs/>
-          <w:color w:val="C00000"/>
-        </w:rPr>
-        <w:t>Se acogieron plenamente 6 de las 7 recomendaciones brindadas por el comité.</w:t>
+        <w:t xml:space="preserve">Agradecemos al Comité y al Dr. Anderson Díaz Pérez la revisión rigurosa del anteproyecto. Valoramos especialmente que el concepto reconozca la pertinencia científica de la investigación y que no identifique un impedimento bioético absoluto para estudiar esta población. Hemos analizado individualmente las siete observaciones y presentamos a continuación nuestra respuesta, junto con la versión 2.0 del protocolo, en la que los ajustes se encuentran resaltados en amarillo. La mayoría de las observaciones dieron lugar a modificaciones directas del protocolo; respecto de la recomendación de redefinir la población exclusivamente por rechazo transfusional, se mantuvo la delimitación original y se amplió su fundamentación científica, metodológica, ética y normativa.</w:t>
       </w:r>
     </w:p>
     <w:p>
@@ -162,7 +154,7 @@
           <w:b/>
           <w:bCs/>
         </w:rPr>
-        <w:t>Se mantienen el diseño, el título, los objetivos y la población.</w:t>
+        <w:t>Tras la revisión de las observaciones, se mantuvieron el diseño, el título, los objetivos y la delimitación de la población, mientras que se ampliaron su fundamentación y las salvaguardas metodológicas y éticas.</w:t>
       </w:r>
       <w:r>
         <w:t xml:space="preserve"> Una cohorte definida solo por el rechazo transfusional respondería una pregunta distinta y no sería comparable con la evidencia disponible. Por eso, en lugar de modificar la población, presentamos su justificación científica, normativa y ética, con precedentes de estudios equivalentes aprobados por comités de ética.</w:t>
@@ -228,34 +220,41 @@
       <w:pPr>
         <w:pStyle w:val="Ttulo1"/>
         <w:keepNext/>
-      </w:pPr>
-      <w:r>
-        <w:lastRenderedPageBreak/>
+        <w:rPr>
+          <w:color w:val="auto"/>
+        </w:rPr>
+      </w:pPr>
+      <w:r>
+        <w:rPr>
+          <w:color w:val="auto"/>
+        </w:rPr>
         <w:t>Observación 1. Justificación de la población</w:t>
       </w:r>
     </w:p>
     <w:p>
       <w:pPr>
-        <w:pBdr>
-          <w:left w:val="single" w:sz="12" w:space="8" w:color="8EAADB"/>
-        </w:pBdr>
-        <w:shd w:val="clear" w:color="auto" w:fill="F2F5FB"/>
-        <w:spacing w:after="120" w:line="276" w:lineRule="auto"/>
-        <w:ind w:left="567" w:right="567"/>
-        <w:jc w:val="both"/>
-      </w:pPr>
-      <w:r>
+        <w:jc w:val="both"/>
         <w:rPr>
           <w:i/>
           <w:iCs/>
         </w:rPr>
-        <w:t>«Fundamentar la selección exclusiva de personas Testigos de Jehová y valorar si la pregunta científica puede responderse mediante una cohorte definida por rechazo transfusional preoperatorio documentado, independientemente de la afiliación religiosa».</w:t>
+      </w:pPr>
+      <w:r>
+        <w:rPr>
+          <w:i/>
+          <w:iCs/>
+        </w:rPr>
+        <w:t xml:space="preserve">«Fundamentar la selección exclusiva de personas Testigos de Jehová y valorar si la pregunta científica puede responderse mediante una cohorte definida por rechazo transfusional preoperatorio documentado, independientemente de la afiliación religiosa».</w:t>
       </w:r>
     </w:p>
     <w:p>
       <w:pPr>
         <w:keepNext/>
         <w:spacing w:before="120" w:after="60"/>
+        <w:rPr>
+          <w:b/>
+          <w:bCs/>
+        </w:rPr>
       </w:pPr>
       <w:r>
         <w:rPr>
@@ -263,25 +262,6 @@
           <w:bCs/>
         </w:rPr>
         <w:t>Respuesta</w:t>
-      </w:r>
-    </w:p>
-    <w:p>
-      <w:pPr>
-        <w:spacing w:after="120" w:line="276" w:lineRule="auto"/>
-        <w:jc w:val="both"/>
-      </w:pPr>
-      <w:r>
-        <w:t xml:space="preserve">Valoramos la alternativa propuesta y la analizamos en detalle. Concluimos, respetuosamente, que </w:t>
-      </w:r>
-      <w:r>
-        <w:rPr>
-          <w:b/>
-          <w:bCs/>
-        </w:rPr>
-        <w:t>la pregunta científica del estudio no puede responderse adecuadamente con una cohorte definida solo por el rechazo transfusional</w:t>
-      </w:r>
-      <w:r>
-        <w:t>, por las razones que siguen. La alternativa sería legítima para otra pregunta —por ejemplo, la de los resultados de un programa institucional de cirugía sin sangre abierto a cualquier paciente—, que podría abordarse en un estudio posterior.</w:t>
       </w:r>
     </w:p>
     <w:p>
@@ -290,6 +270,15 @@
         <w:spacing w:before="120" w:after="60"/>
       </w:pPr>
       <w:r>
+        <w:t xml:space="preserve">La recomendación fue analizada en detalle. Tras evaluar sus implicaciones metodológicas, consideramos que una cohorte definida exclusivamente por rechazo transfusional respondería una pregunta distinta y reduciría la comparabilidad directa con la literatura que sustenta el vacío de conocimiento planteado.</w:t>
+      </w:r>
+    </w:p>
+    <w:p>
+      <w:pPr>
+        <w:keepNext/>
+        <w:spacing w:before="120" w:after="60"/>
+      </w:pPr>
+      <w:r>
         <w:rPr>
           <w:b/>
           <w:bCs/>
@@ -358,7 +347,7 @@
         <w:t>d) Justicia y valor social.</w:t>
       </w:r>
       <w:r>
-        <w:t xml:space="preserve"> La Corte Constitucional ha reconocido el derecho de los pacientes Testigos de Jehová capaces a ser tratados sin transfusión y, en un caso de cirugía cardiovascular, ordenó practicar un reemplazo valvular aórtico sin transfusión (T-476 de 2016; véanse también T-052 de 2010 y T-083 de 2021). Si esa prestación es exigible, generar evidencia local sobre su seguridad es un deber de justicia. Excluir a este grupo, o diluirlo en una población heterogénea, lo privaría de información útil para sus propias </w:t>
+        <w:t xml:space="preserve"> La Corte Constitucional ha reconocido el derecho de los pacientes Testigos de Jehová capaces a ser tratados sin transfusión y, en un caso de cirugía cardiovascular, ordenó practicar un reemplazo valvular aórtico sin transfusión (T-476 de 2016; véanse también T-052 de 2010 y T-083 de 2021). Si esa prestación es exigible, generar evidencia local sobre sus desenlaces perioperatorios aporta información directamente relevante para esta población y es coherente con el principio de justicia. Excluir a este grupo, o diluirlo en una población heterogénea, lo privaría de información útil para sus propias </w:t>
         <w:lastRenderedPageBreak/>
         <w:t>decisiones, contra la distribución equitativa de cargas y beneficios que exigen el Informe Belmont y la pauta 3 de CIOMS-OMS (2016).</w:t>
       </w:r>
@@ -376,7 +365,7 @@
         <w:t>e) La religión no es una variable del estudio.</w:t>
       </w:r>
       <w:r>
-        <w:t xml:space="preserve"> La condición religiosa es constante en toda la cohorte y no se comparan Testigos de Jehová con otros grupos. Por diseño, es estadísticamente imposible atribuir algún desenlace a la religión. La exposición analizada es el tipo de cirugía.</w:t>
+        <w:t xml:space="preserve"> La afiliación religiosa no es una variable de exposición ni de comparación y, al ser constante en la cohorte, no puede estimarse su asociación con los desenlaces. La exposición analizada es el tipo de cirugía.</w:t>
       </w:r>
     </w:p>
     <w:p>
@@ -441,12 +430,6 @@
         <w:gridCol w:w="3006"/>
       </w:tblGrid>
       <w:tr>
-        <w:tblPrEx>
-          <w:tblCellMar>
-            <w:top w:w="0" w:type="dxa"/>
-            <w:bottom w:w="0" w:type="dxa"/>
-          </w:tblCellMar>
-        </w:tblPrEx>
         <w:trPr>
           <w:tblHeader/>
         </w:trPr>
@@ -584,12 +567,6 @@
         </w:tc>
       </w:tr>
       <w:tr>
-        <w:tblPrEx>
-          <w:tblCellMar>
-            <w:top w:w="0" w:type="dxa"/>
-            <w:bottom w:w="0" w:type="dxa"/>
-          </w:tblCellMar>
-        </w:tblPrEx>
         <w:trPr>
           <w:cantSplit/>
         </w:trPr>
@@ -647,7 +624,7 @@
                 <w:sz w:val="18"/>
                 <w:szCs w:val="18"/>
               </w:rPr>
-              <w:t xml:space="preserve">Brasil, InCor – HC-FMUSP</w:t>
+              <w:t>Brasil, InCor – HC-FMUSP</w:t>
             </w:r>
           </w:p>
         </w:tc>
@@ -727,12 +704,6 @@
         </w:tc>
       </w:tr>
       <w:tr>
-        <w:tblPrEx>
-          <w:tblCellMar>
-            <w:top w:w="0" w:type="dxa"/>
-            <w:bottom w:w="0" w:type="dxa"/>
-          </w:tblCellMar>
-        </w:tblPrEx>
         <w:trPr>
           <w:cantSplit/>
         </w:trPr>
@@ -755,13 +726,17 @@
           <w:p>
             <w:pPr>
               <w:spacing w:after="40"/>
-            </w:pPr>
-            <w:r>
-              <w:rPr>
-                <w:sz w:val="18"/>
-                <w:szCs w:val="18"/>
-              </w:rPr>
-              <w:t xml:space="preserve">Hartrumpf et al., J Clin Med 2023</w:t>
+              <w:rPr>
+                <w:lang w:val="en-US"/>
+              </w:rPr>
+            </w:pPr>
+            <w:r>
+              <w:rPr>
+                <w:sz w:val="18"/>
+                <w:szCs w:val="18"/>
+                <w:lang w:val="en-US"/>
+              </w:rPr>
+              <w:t>Hartrumpf et al., J Clin Med 2023</w:t>
             </w:r>
           </w:p>
         </w:tc>
@@ -870,12 +845,6 @@
         </w:tc>
       </w:tr>
       <w:tr>
-        <w:tblPrEx>
-          <w:tblCellMar>
-            <w:top w:w="0" w:type="dxa"/>
-            <w:bottom w:w="0" w:type="dxa"/>
-          </w:tblCellMar>
-        </w:tblPrEx>
         <w:trPr>
           <w:cantSplit/>
         </w:trPr>
@@ -898,13 +867,17 @@
           <w:p>
             <w:pPr>
               <w:spacing w:after="40"/>
-            </w:pPr>
-            <w:r>
-              <w:rPr>
-                <w:sz w:val="18"/>
-                <w:szCs w:val="18"/>
-              </w:rPr>
-              <w:t xml:space="preserve">Pattakos et al., Arch Intern Med 2012</w:t>
+              <w:rPr>
+                <w:lang w:val="en-US"/>
+              </w:rPr>
+            </w:pPr>
+            <w:r>
+              <w:rPr>
+                <w:sz w:val="18"/>
+                <w:szCs w:val="18"/>
+                <w:lang w:val="en-US"/>
+              </w:rPr>
+              <w:t>Pattakos et al., Arch Intern Med 2012</w:t>
             </w:r>
           </w:p>
         </w:tc>
@@ -933,7 +906,7 @@
                 <w:sz w:val="18"/>
                 <w:szCs w:val="18"/>
               </w:rPr>
-              <w:t xml:space="preserve">EE. UU., Cleveland Clinic</w:t>
+              <w:t>EE. UU., Cleveland Clinic</w:t>
             </w:r>
           </w:p>
         </w:tc>
@@ -997,12 +970,6 @@
         </w:tc>
       </w:tr>
       <w:tr>
-        <w:tblPrEx>
-          <w:tblCellMar>
-            <w:top w:w="0" w:type="dxa"/>
-            <w:bottom w:w="0" w:type="dxa"/>
-          </w:tblCellMar>
-        </w:tblPrEx>
         <w:trPr>
           <w:cantSplit/>
         </w:trPr>
@@ -1124,12 +1091,6 @@
         </w:tc>
       </w:tr>
       <w:tr>
-        <w:tblPrEx>
-          <w:tblCellMar>
-            <w:top w:w="0" w:type="dxa"/>
-            <w:bottom w:w="0" w:type="dxa"/>
-          </w:tblCellMar>
-        </w:tblPrEx>
         <w:trPr>
           <w:cantSplit/>
         </w:trPr>
@@ -1187,7 +1148,7 @@
                 <w:sz w:val="18"/>
                 <w:szCs w:val="18"/>
               </w:rPr>
-              <w:t xml:space="preserve">Países Bajos, Amphia Hospital (Breda)</w:t>
+              <w:t>Países Bajos, Amphia Hospital (Breda)</w:t>
             </w:r>
           </w:p>
         </w:tc>
@@ -1251,12 +1212,6 @@
         </w:tc>
       </w:tr>
       <w:tr>
-        <w:tblPrEx>
-          <w:tblCellMar>
-            <w:top w:w="0" w:type="dxa"/>
-            <w:bottom w:w="0" w:type="dxa"/>
-          </w:tblCellMar>
-        </w:tblPrEx>
         <w:trPr>
           <w:cantSplit/>
         </w:trPr>
@@ -1285,7 +1240,7 @@
                 <w:sz w:val="18"/>
                 <w:szCs w:val="18"/>
               </w:rPr>
-              <w:t xml:space="preserve">Helwani et al., J Cardiothorac Vasc Anesth 2023</w:t>
+              <w:t>Helwani et al., J Cardiothorac Vasc Anesth 2023</w:t>
             </w:r>
           </w:p>
         </w:tc>
@@ -1378,12 +1333,6 @@
         </w:tc>
       </w:tr>
       <w:tr>
-        <w:tblPrEx>
-          <w:tblCellMar>
-            <w:top w:w="0" w:type="dxa"/>
-            <w:bottom w:w="0" w:type="dxa"/>
-          </w:tblCellMar>
-        </w:tblPrEx>
         <w:trPr>
           <w:cantSplit/>
         </w:trPr>
@@ -1505,12 +1454,6 @@
         </w:tc>
       </w:tr>
       <w:tr>
-        <w:tblPrEx>
-          <w:tblCellMar>
-            <w:top w:w="0" w:type="dxa"/>
-            <w:bottom w:w="0" w:type="dxa"/>
-          </w:tblCellMar>
-        </w:tblPrEx>
         <w:trPr>
           <w:cantSplit/>
         </w:trPr>
@@ -1632,12 +1575,6 @@
         </w:tc>
       </w:tr>
       <w:tr>
-        <w:tblPrEx>
-          <w:tblCellMar>
-            <w:top w:w="0" w:type="dxa"/>
-            <w:bottom w:w="0" w:type="dxa"/>
-          </w:tblCellMar>
-        </w:tblPrEx>
         <w:trPr>
           <w:cantSplit/>
         </w:trPr>
@@ -1666,7 +1603,7 @@
                 <w:sz w:val="18"/>
                 <w:szCs w:val="18"/>
               </w:rPr>
-              <w:t xml:space="preserve">Vaislic et al., J Cardiothorac Surg 2012</w:t>
+              <w:t>Vaislic et al., J Cardiothorac Surg 2012</w:t>
             </w:r>
           </w:p>
         </w:tc>
@@ -1759,12 +1696,6 @@
         </w:tc>
       </w:tr>
       <w:tr>
-        <w:tblPrEx>
-          <w:tblCellMar>
-            <w:top w:w="0" w:type="dxa"/>
-            <w:bottom w:w="0" w:type="dxa"/>
-          </w:tblCellMar>
-        </w:tblPrEx>
         <w:trPr>
           <w:cantSplit/>
         </w:trPr>
@@ -1886,12 +1817,6 @@
         </w:tc>
       </w:tr>
       <w:tr>
-        <w:tblPrEx>
-          <w:tblCellMar>
-            <w:top w:w="0" w:type="dxa"/>
-            <w:bottom w:w="0" w:type="dxa"/>
-          </w:tblCellMar>
-        </w:tblPrEx>
         <w:trPr>
           <w:cantSplit/>
         </w:trPr>
@@ -2126,26 +2051,30 @@
       <w:pPr>
         <w:pStyle w:val="Ttulo1"/>
         <w:keepNext/>
-      </w:pPr>
-      <w:r>
+        <w:rPr>
+          <w:color w:val="auto"/>
+        </w:rPr>
+      </w:pPr>
+      <w:r>
+        <w:rPr>
+          <w:color w:val="auto"/>
+        </w:rPr>
         <w:t>Observación 2. Coherencia del protocolo</w:t>
       </w:r>
     </w:p>
     <w:p>
       <w:pPr>
-        <w:pBdr>
-          <w:left w:val="single" w:sz="12" w:space="8" w:color="8EAADB"/>
-        </w:pBdr>
-        <w:shd w:val="clear" w:color="auto" w:fill="F2F5FB"/>
-        <w:spacing w:after="120" w:line="276" w:lineRule="auto"/>
-        <w:ind w:left="567" w:right="567"/>
-        <w:jc w:val="both"/>
-      </w:pPr>
-      <w:r>
+        <w:jc w:val="both"/>
         <w:rPr>
           <w:i/>
           <w:iCs/>
         </w:rPr>
+      </w:pPr>
+      <w:r>
+        <w:rPr>
+          <w:i/>
+          <w:iCs/>
+        </w:rPr>
         <w:t>«Ajustar, si corresponde, título, objetivos, población, criterios de inclusión e identificación de casos. Diferenciar expresamente la identidad religiosa de las decisiones clínicas individuales sobre componentes sanguíneos».</w:t>
       </w:r>
     </w:p>
@@ -2153,6 +2082,10 @@
       <w:pPr>
         <w:keepNext/>
         <w:spacing w:before="120" w:after="60"/>
+        <w:rPr>
+          <w:b/>
+          <w:bCs/>
+        </w:rPr>
       </w:pPr>
       <w:r>
         <w:rPr>
@@ -2164,25 +2097,11 @@
     </w:p>
     <w:p>
       <w:pPr>
-        <w:spacing w:after="120" w:line="276" w:lineRule="auto"/>
-        <w:jc w:val="both"/>
-      </w:pPr>
-      <w:r>
-        <w:rPr>
-          <w:b/>
-          <w:bCs/>
-          <w:color w:val="C00000"/>
-        </w:rPr>
-        <w:t>Acogemos plenamente</w:t>
-      </w:r>
-      <w:r>
-        <w:rPr>
-          <w:color w:val="C00000"/>
-        </w:rPr>
-        <w:t xml:space="preserve"> </w:t>
-      </w:r>
-      <w:r>
-        <w:t xml:space="preserve">la segunda parte de la observación. Respecto de la primera, consideramos que no corresponde modificar el título, los objetivos ni la pregunta, porque ya son coherentes con la distinción solicitada. El objetivo general, los específicos, la pregunta de investigación y la población ya exigían, desde la versión 1, el «rechazo transfusional documentado» como condición, además de la afiliación. Por su parte, el título usa el descriptor DeCS/MeSH que permite indexar y comparar el estudio. La versión  presentada también establecía que la aceptación de técnicas o hemoderivados «no debe presuponerse por la pertenencia religiosa, sino confirmarse con cada persona» (num. 2.1.5).</w:t>
+        <w:keepNext/>
+        <w:spacing w:before="120" w:after="60"/>
+      </w:pPr>
+      <w:r>
+        <w:t xml:space="preserve">La observación fue incorporada en cuanto a la diferenciación explícita entre identidad religiosa y decisiones clínicas individuales. Tras revisar nuevamente la coherencia entre el título, la pregunta, los objetivos y la población, consideramos que no se requiere modificar estos elementos, porque ya son coherentes con la distinción solicitada. El objetivo general, los específicos, la pregunta de investigación y la población ya exigían, desde la versión 1, el «rechazo transfusional documentado» como condición, además de la afiliación. Por su parte, el título usa el descriptor DeCS/MeSH que permite indexar y comparar el estudio. La versión  presentada también establece que la aceptación de técnicas o hemoderivados «no debe presuponerse por la pertenencia religiosa, sino confirmarse con cada persona» (num. 2.1.5).</w:t>
       </w:r>
     </w:p>
     <w:p>
@@ -2333,6 +2252,7 @@
           <w:b/>
           <w:bCs/>
         </w:rPr>
+        <w:lastRenderedPageBreak/>
         <w:t>Base analítica sin variable religiosa</w:t>
       </w:r>
       <w:r>
@@ -2353,27 +2273,30 @@
       <w:pPr>
         <w:pStyle w:val="Ttulo1"/>
         <w:keepNext/>
-      </w:pPr>
-      <w:r>
-        <w:lastRenderedPageBreak/>
+        <w:rPr>
+          <w:color w:val="auto"/>
+        </w:rPr>
+      </w:pPr>
+      <w:r>
+        <w:rPr>
+          <w:color w:val="auto"/>
+        </w:rPr>
         <w:t>Observación 3. Contexto religioso y temporal</w:t>
       </w:r>
     </w:p>
     <w:p>
       <w:pPr>
-        <w:pBdr>
-          <w:left w:val="single" w:sz="12" w:space="8" w:color="8EAADB"/>
-        </w:pBdr>
-        <w:shd w:val="clear" w:color="auto" w:fill="F2F5FB"/>
-        <w:spacing w:after="120" w:line="276" w:lineRule="auto"/>
-        <w:ind w:left="567" w:right="567"/>
-        <w:jc w:val="both"/>
-      </w:pPr>
-      <w:r>
+        <w:jc w:val="both"/>
         <w:rPr>
           <w:i/>
           <w:iCs/>
         </w:rPr>
+      </w:pPr>
+      <w:r>
+        <w:rPr>
+          <w:i/>
+          <w:iCs/>
+        </w:rPr>
         <w:t>«Actualizar el marco teórico con la comunicación del 18 de septiembre de 2026 sobre decisiones individuales respecto de componentes sanguíneos, aclarando que es posterior al período estudiado (2020–2025)».</w:t>
       </w:r>
     </w:p>
@@ -2396,21 +2319,7 @@
         <w:jc w:val="both"/>
       </w:pPr>
       <w:r>
-        <w:rPr>
-          <w:b/>
-          <w:bCs/>
-          <w:color w:val="C00000"/>
-        </w:rPr>
-        <w:t>Acogida</w:t>
-      </w:r>
-      <w:r>
-        <w:rPr>
-          <w:color w:val="C00000"/>
-        </w:rPr>
-        <w:t xml:space="preserve">. </w:t>
-      </w:r>
-      <w:r>
-        <w:t>Se incorporó el contexto, con fuentes primarias y secundarias, y sus implicaciones metodológicas:</w:t>
+        <w:t>La observación fue acogida y se incorporó al protocolo la actualización del contexto religioso y su delimitación temporal respecto del periodo de estudio 2020–2025, con fuentes primarias y secundarias, y sus implicaciones metodológicas:</w:t>
       </w:r>
     </w:p>
     <w:p>
@@ -2638,26 +2547,30 @@
       <w:pPr>
         <w:pStyle w:val="Ttulo1"/>
         <w:keepNext/>
-      </w:pPr>
-      <w:r>
+        <w:rPr>
+          <w:color w:val="auto"/>
+        </w:rPr>
+      </w:pPr>
+      <w:r>
+        <w:rPr>
+          <w:color w:val="auto"/>
+        </w:rPr>
         <w:t>Observación 4. Riesgo y consentimiento</w:t>
       </w:r>
     </w:p>
     <w:p>
       <w:pPr>
-        <w:pBdr>
-          <w:left w:val="single" w:sz="12" w:space="8" w:color="8EAADB"/>
-        </w:pBdr>
-        <w:shd w:val="clear" w:color="auto" w:fill="F2F5FB"/>
-        <w:spacing w:after="120" w:line="276" w:lineRule="auto"/>
-        <w:ind w:left="567" w:right="567"/>
-        <w:jc w:val="both"/>
-      </w:pPr>
-      <w:r>
+        <w:jc w:val="both"/>
         <w:rPr>
           <w:i/>
           <w:iCs/>
         </w:rPr>
+      </w:pPr>
+      <w:r>
+        <w:rPr>
+          <w:i/>
+          <w:iCs/>
+        </w:rPr>
         <w:t>«Sustentar la clasificación del riesgo y la eventual dispensa del consentimiento informado conforme a la Resolución 8430 de 1993, sin asumir que la naturaleza retrospectiva concede una dispensa automática».</w:t>
       </w:r>
     </w:p>
@@ -2665,32 +2578,27 @@
       <w:pPr>
         <w:keepNext/>
         <w:spacing w:before="120" w:after="60"/>
-      </w:pPr>
-      <w:r>
-        <w:rPr>
-          <w:b/>
-          <w:bCs/>
-        </w:rPr>
+        <w:rPr>
+          <w:b/>
+          <w:bCs/>
+        </w:rPr>
+      </w:pPr>
+      <w:r>
+        <w:rPr>
+          <w:b/>
+          <w:bCs/>
+        </w:rPr>
+        <w:lastRenderedPageBreak/>
         <w:t>Respuesta</w:t>
       </w:r>
     </w:p>
     <w:p>
       <w:pPr>
-        <w:spacing w:after="120" w:line="276" w:lineRule="auto"/>
-        <w:jc w:val="both"/>
-      </w:pPr>
-      <w:r>
-        <w:rPr>
-          <w:b/>
-          <w:bCs/>
-          <w:color w:val="C00000"/>
-        </w:rPr>
-        <w:t>Compartimos plenamente el principio de que la naturaleza retrospectiva no concede una dispensa automática</w:t>
-      </w:r>
-      <w:r>
-        <w:t xml:space="preserve">. Por ello, la versión 2.0 sustenta por separado la clasificación del riesgo y la dispensa, y verifica </w:t>
-        <w:lastRenderedPageBreak/>
-        <w:t>cada requisito normativo de forma independiente. Reconocemos que la decisión final corresponde al Comité.</w:t>
+        <w:keepNext/>
+        <w:spacing w:before="120" w:after="60"/>
+      </w:pPr>
+      <w:r>
+        <w:t>Se acoge la observación. La versión 2.0 no presume que el carácter retrospectivo del estudio determine automáticamente su clasificación de riesgo ni la dispensa del consentimiento informado; ambos aspectos se sustentan de manera independiente y quedan sujetos a la valoración del Comité.</w:t>
       </w:r>
     </w:p>
     <w:p>
@@ -2729,12 +2637,6 @@
         <w:gridCol w:w="2000"/>
       </w:tblGrid>
       <w:tr>
-        <w:tblPrEx>
-          <w:tblCellMar>
-            <w:top w:w="0" w:type="dxa"/>
-            <w:bottom w:w="0" w:type="dxa"/>
-          </w:tblCellMar>
-        </w:tblPrEx>
         <w:trPr>
           <w:tblHeader/>
         </w:trPr>
@@ -2839,12 +2741,6 @@
         </w:tc>
       </w:tr>
       <w:tr>
-        <w:tblPrEx>
-          <w:tblCellMar>
-            <w:top w:w="0" w:type="dxa"/>
-            <w:bottom w:w="0" w:type="dxa"/>
-          </w:tblCellMar>
-        </w:tblPrEx>
         <w:trPr>
           <w:cantSplit/>
         </w:trPr>
@@ -2937,12 +2833,6 @@
         </w:tc>
       </w:tr>
       <w:tr>
-        <w:tblPrEx>
-          <w:tblCellMar>
-            <w:top w:w="0" w:type="dxa"/>
-            <w:bottom w:w="0" w:type="dxa"/>
-          </w:tblCellMar>
-        </w:tblPrEx>
         <w:trPr>
           <w:cantSplit/>
         </w:trPr>
@@ -3000,7 +2890,7 @@
                 <w:sz w:val="18"/>
                 <w:szCs w:val="18"/>
               </w:rPr>
-              <w:t xml:space="preserve">Seudonimización desde la extracción, base sin identificadores, claves custodiadas por separado y destruidas antes del análisis, y resultados agregados con control de celdas pequeñas.</w:t>
+              <w:t>Seudonimización desde la extracción, base sin identificadores, claves custodiadas por separado y destruidas antes del análisis, y resultados agregados con control de celdas pequeñas.</w:t>
             </w:r>
           </w:p>
         </w:tc>
@@ -3035,12 +2925,6 @@
         </w:tc>
       </w:tr>
       <w:tr>
-        <w:tblPrEx>
-          <w:tblCellMar>
-            <w:top w:w="0" w:type="dxa"/>
-            <w:bottom w:w="0" w:type="dxa"/>
-          </w:tblCellMar>
-        </w:tblPrEx>
         <w:trPr>
           <w:cantSplit/>
         </w:trPr>
@@ -3133,12 +3017,6 @@
         </w:tc>
       </w:tr>
       <w:tr>
-        <w:tblPrEx>
-          <w:tblCellMar>
-            <w:top w:w="0" w:type="dxa"/>
-            <w:bottom w:w="0" w:type="dxa"/>
-          </w:tblCellMar>
-        </w:tblPrEx>
         <w:trPr>
           <w:cantSplit/>
         </w:trPr>
@@ -3242,18 +3120,14 @@
         <w:jc w:val="both"/>
       </w:pPr>
       <w:r>
-        <w:t xml:space="preserve">Sobre el tercer supuesto: el artículo 11 se refiere a investigaciones que «traten» aspectos sensitivos de la conducta, es decir, que los indaguen o analicen. El estudio no hace ninguna de las dos cosas. La sensibilidad del dato religioso es un asunto de </w:t>
-      </w:r>
-      <w:r>
-        <w:rPr>
-          <w:b/>
-          <w:bCs/>
-        </w:rPr>
-        <w:t>protección de datos</w:t>
-      </w:r>
-      <w:r>
-        <w:t xml:space="preserve"> (Ley 1581 de 2012), que se atiende con el plan del numeral 3.9.1, y no un aspecto de la conducta que el estudio examine. Así lo distingue también el artículo 8 de la misma resolución, que exige proteger la privacidad del sujeto e identificarlo solo cuando los resultados lo requieran y él lo autorice. En este estudio, los resultados nunca lo requieren.</w:t>
-      </w:r>
+        <w:t xml:space="preserve">Sobre el tercer supuesto: el artículo 11 se refiere a investigaciones que «traten» aspectos sensitivos de la conducta, es decir, que los indaguen o analicen. El estudio no hace ninguna de las dos cosas. El estudio no indagará ni valorará prácticas, creencias o conductas religiosas; la condición de Testigo de Jehová se utilizará exclusivamente como criterio de delimitación de la población. Dado que esta información constituye además un dato sensible conforme a la Ley 1581 de 2012, su tratamiento estará sujeto a las salvaguardas reforzadas del numeral 3.9.1. Así lo distingue también el artículo 8 de la misma resolución, que exige proteger la privacidad del sujeto e identificarlo solo cuando los resultados lo requieran y él lo autorice. En este estudio, los resultados nunca lo requieren.</w:t>
+      </w:r>
+    </w:p>
+    <w:p>
+      <w:pPr>
+        <w:spacing w:after="120" w:line="276" w:lineRule="auto"/>
+        <w:jc w:val="both"/>
+      </w:pPr>
     </w:p>
     <w:p>
       <w:pPr>
@@ -3334,6 +3208,7 @@
           <w:b/>
           <w:bCs/>
         </w:rPr>
+        <w:lastRenderedPageBreak/>
         <w:t>El contacto aumentaría el riesgo que se busca evitar.</w:t>
       </w:r>
       <w:r>
@@ -3376,7 +3251,6 @@
           <w:b/>
           <w:bCs/>
         </w:rPr>
-        <w:lastRenderedPageBreak/>
         <w:t>Respeto de los derechos de los titulares.</w:t>
       </w:r>
       <w:r>
@@ -3389,7 +3263,7 @@
         <w:jc w:val="both"/>
       </w:pPr>
       <w:r>
-        <w:t xml:space="preserve">Esta misma fundamentación ha sido aceptada por comités de ética en estudios con idéntico diseño y población: InCor (Brasil, n.º 7.441.177) y el estudio alemán de Hartrumpf et al. (n.º E-01-20230411) (ver tabla de precedentes). Si el Comité considera necesaria alguna salvaguarda adicional como condición de la dispensa, la incorporaremos antes de iniciar la recolección.</w:t>
+        <w:t>Esta misma fundamentación ha sido aceptada por comités de ética en estudios con idéntico diseño y población: InCor (Brasil, n.º 7.441.177) y el estudio alemán de Hartrumpf et al. (n.º E-01-20230411) (ver tabla de precedentes). Si el Comité considera necesaria alguna salvaguarda adicional como condición de la dispensa, la incorporaremos antes de iniciar la recolección.</w:t>
       </w:r>
     </w:p>
     <w:p>
@@ -3491,26 +3365,30 @@
       <w:pPr>
         <w:pStyle w:val="Ttulo1"/>
         <w:keepNext/>
-      </w:pPr>
-      <w:r>
+        <w:rPr>
+          <w:color w:val="auto"/>
+        </w:rPr>
+      </w:pPr>
+      <w:r>
+        <w:rPr>
+          <w:color w:val="auto"/>
+        </w:rPr>
         <w:t>Observación 5. Protección de datos sensibles</w:t>
       </w:r>
     </w:p>
     <w:p>
       <w:pPr>
-        <w:pBdr>
-          <w:left w:val="single" w:sz="12" w:space="8" w:color="8EAADB"/>
-        </w:pBdr>
-        <w:shd w:val="clear" w:color="auto" w:fill="F2F5FB"/>
-        <w:spacing w:after="120" w:line="276" w:lineRule="auto"/>
-        <w:ind w:left="567" w:right="567"/>
-        <w:jc w:val="both"/>
-      </w:pPr>
-      <w:r>
+        <w:jc w:val="both"/>
         <w:rPr>
           <w:i/>
           <w:iCs/>
         </w:rPr>
+      </w:pPr>
+      <w:r>
+        <w:rPr>
+          <w:i/>
+          <w:iCs/>
+        </w:rPr>
         <w:t>«Describir responsables y controles de acceso, codificación, almacenamiento, custodia de claves y manejo de incidentes. Prevenir la identificación indirecta y la divulgación no autorizada de datos clínicos o religiosos, conforme a la Ley 1581 de 2012».</w:t>
       </w:r>
     </w:p>
@@ -3518,6 +3396,10 @@
       <w:pPr>
         <w:keepNext/>
         <w:spacing w:before="120" w:after="60"/>
+        <w:rPr>
+          <w:b/>
+          <w:bCs/>
+        </w:rPr>
       </w:pPr>
       <w:r>
         <w:rPr>
@@ -3529,19 +3411,11 @@
     </w:p>
     <w:p>
       <w:pPr>
-        <w:spacing w:after="120" w:line="276" w:lineRule="auto"/>
-        <w:jc w:val="both"/>
-      </w:pPr>
-      <w:r>
-        <w:rPr>
-          <w:b/>
-          <w:bCs/>
-          <w:color w:val="C00000"/>
-        </w:rPr>
-        <w:t>Acogida</w:t>
-      </w:r>
-      <w:r>
-        <w:t xml:space="preserve">. Se agregó el numeral </w:t>
+        <w:keepNext/>
+        <w:spacing w:before="120" w:after="60"/>
+      </w:pPr>
+      <w:r>
+        <w:t xml:space="preserve">La observación fue acogida en su totalidad. Se incorporó el numeral </w:t>
       </w:r>
       <w:r>
         <w:rPr>
@@ -3576,12 +3450,6 @@
         <w:gridCol w:w="7206"/>
       </w:tblGrid>
       <w:tr>
-        <w:tblPrEx>
-          <w:tblCellMar>
-            <w:top w:w="0" w:type="dxa"/>
-            <w:bottom w:w="0" w:type="dxa"/>
-          </w:tblCellMar>
-        </w:tblPrEx>
         <w:trPr>
           <w:tblHeader/>
         </w:trPr>
@@ -3653,12 +3521,6 @@
         </w:tc>
       </w:tr>
       <w:tr>
-        <w:tblPrEx>
-          <w:tblCellMar>
-            <w:top w:w="0" w:type="dxa"/>
-            <w:bottom w:w="0" w:type="dxa"/>
-          </w:tblCellMar>
-        </w:tblPrEx>
         <w:trPr>
           <w:cantSplit/>
         </w:trPr>
@@ -3722,12 +3584,6 @@
         </w:tc>
       </w:tr>
       <w:tr>
-        <w:tblPrEx>
-          <w:tblCellMar>
-            <w:top w:w="0" w:type="dxa"/>
-            <w:bottom w:w="0" w:type="dxa"/>
-          </w:tblCellMar>
-        </w:tblPrEx>
         <w:trPr>
           <w:cantSplit/>
         </w:trPr>
@@ -3791,12 +3647,6 @@
         </w:tc>
       </w:tr>
       <w:tr>
-        <w:tblPrEx>
-          <w:tblCellMar>
-            <w:top w:w="0" w:type="dxa"/>
-            <w:bottom w:w="0" w:type="dxa"/>
-          </w:tblCellMar>
-        </w:tblPrEx>
         <w:trPr>
           <w:cantSplit/>
         </w:trPr>
@@ -3860,12 +3710,6 @@
         </w:tc>
       </w:tr>
       <w:tr>
-        <w:tblPrEx>
-          <w:tblCellMar>
-            <w:top w:w="0" w:type="dxa"/>
-            <w:bottom w:w="0" w:type="dxa"/>
-          </w:tblCellMar>
-        </w:tblPrEx>
         <w:trPr>
           <w:cantSplit/>
         </w:trPr>
@@ -3894,6 +3738,7 @@
                 <w:sz w:val="18"/>
                 <w:szCs w:val="18"/>
               </w:rPr>
+              <w:lastRenderedPageBreak/>
               <w:t>Almacenamiento</w:t>
             </w:r>
           </w:p>
@@ -3923,18 +3768,12 @@
                 <w:sz w:val="18"/>
                 <w:szCs w:val="18"/>
               </w:rPr>
-              <w:t xml:space="preserve">REDCap institucional (perfiles, auditoría, autenticación) o archivo cifrado en servidor institucional, con respaldos cifrados. Conservación de cinco años y eliminación.</w:t>
+              <w:t>REDCap institucional (perfiles, auditoría, autenticación) o archivo cifrado en servidor institucional, con respaldos cifrados. Conservación de cinco años y eliminación.</w:t>
             </w:r>
           </w:p>
         </w:tc>
       </w:tr>
       <w:tr>
-        <w:tblPrEx>
-          <w:tblCellMar>
-            <w:top w:w="0" w:type="dxa"/>
-            <w:bottom w:w="0" w:type="dxa"/>
-          </w:tblCellMar>
-        </w:tblPrEx>
         <w:trPr>
           <w:cantSplit/>
         </w:trPr>
@@ -3998,12 +3837,6 @@
         </w:tc>
       </w:tr>
       <w:tr>
-        <w:tblPrEx>
-          <w:tblCellMar>
-            <w:top w:w="0" w:type="dxa"/>
-            <w:bottom w:w="0" w:type="dxa"/>
-          </w:tblCellMar>
-        </w:tblPrEx>
         <w:trPr>
           <w:cantSplit/>
         </w:trPr>
@@ -4067,12 +3900,6 @@
         </w:tc>
       </w:tr>
       <w:tr>
-        <w:tblPrEx>
-          <w:tblCellMar>
-            <w:top w:w="0" w:type="dxa"/>
-            <w:bottom w:w="0" w:type="dxa"/>
-          </w:tblCellMar>
-        </w:tblPrEx>
         <w:trPr>
           <w:cantSplit/>
         </w:trPr>
@@ -4101,7 +3928,6 @@
                 <w:sz w:val="18"/>
                 <w:szCs w:val="18"/>
               </w:rPr>
-              <w:lastRenderedPageBreak/>
               <w:t>Identificación indirecta</w:t>
             </w:r>
           </w:p>
@@ -4165,26 +3991,30 @@
       <w:pPr>
         <w:pStyle w:val="Ttulo1"/>
         <w:keepNext/>
-      </w:pPr>
-      <w:r>
+        <w:rPr>
+          <w:color w:val="auto"/>
+        </w:rPr>
+      </w:pPr>
+      <w:r>
+        <w:rPr>
+          <w:color w:val="auto"/>
+        </w:rPr>
         <w:t>Observación 6. Interpretación y publicación</w:t>
       </w:r>
     </w:p>
     <w:p>
       <w:pPr>
-        <w:pBdr>
-          <w:left w:val="single" w:sz="12" w:space="8" w:color="8EAADB"/>
-        </w:pBdr>
-        <w:shd w:val="clear" w:color="auto" w:fill="F2F5FB"/>
-        <w:spacing w:after="120" w:line="276" w:lineRule="auto"/>
-        <w:ind w:left="567" w:right="567"/>
-        <w:jc w:val="both"/>
-      </w:pPr>
-      <w:r>
+        <w:jc w:val="both"/>
         <w:rPr>
           <w:i/>
           <w:iCs/>
         </w:rPr>
+      </w:pPr>
+      <w:r>
+        <w:rPr>
+          <w:i/>
+          <w:iCs/>
+        </w:rPr>
         <w:t>«Definir medidas para evitar inferencias causales indebidas, atribuciones de complicaciones a la religión y tablas o descripciones que puedan identificar o estigmatizar a los pacientes».</w:t>
       </w:r>
     </w:p>
@@ -4192,6 +4022,10 @@
       <w:pPr>
         <w:keepNext/>
         <w:spacing w:before="120" w:after="60"/>
+        <w:rPr>
+          <w:b/>
+          <w:bCs/>
+        </w:rPr>
       </w:pPr>
       <w:r>
         <w:rPr>
@@ -4203,19 +4037,11 @@
     </w:p>
     <w:p>
       <w:pPr>
-        <w:spacing w:after="120" w:line="276" w:lineRule="auto"/>
-        <w:jc w:val="both"/>
-      </w:pPr>
-      <w:r>
-        <w:rPr>
-          <w:b/>
-          <w:bCs/>
-          <w:color w:val="C00000"/>
-        </w:rPr>
-        <w:t>Acogida.</w:t>
-      </w:r>
-      <w:r>
-        <w:t xml:space="preserve"> El protocolo ya excluía las inferencias causales y la afirmación de equivalencia o seguridad (num. 1.1.2, 1.4, 3.7). La versión 2.0 agrega el numeral </w:t>
+        <w:keepNext/>
+        <w:spacing w:before="120" w:after="60"/>
+      </w:pPr>
+      <w:r>
+        <w:t xml:space="preserve">La observación fue acogida. El protocolo ya excluía las inferencias causales y la afirmación de equivalencia o seguridad (num. 1.1.2, 1.4, 3.7). La versión 2.0 agrega el numeral </w:t>
       </w:r>
       <w:r>
         <w:rPr>
@@ -4378,26 +4204,31 @@
       <w:pPr>
         <w:pStyle w:val="Ttulo1"/>
         <w:keepNext/>
-      </w:pPr>
-      <w:r>
+        <w:rPr>
+          <w:color w:val="auto"/>
+        </w:rPr>
+      </w:pPr>
+      <w:r>
+        <w:rPr>
+          <w:color w:val="auto"/>
+        </w:rPr>
+        <w:lastRenderedPageBreak/>
         <w:t>Observación 7. Documentación transfusional</w:t>
       </w:r>
     </w:p>
     <w:p>
       <w:pPr>
-        <w:pBdr>
-          <w:left w:val="single" w:sz="12" w:space="8" w:color="8EAADB"/>
-        </w:pBdr>
-        <w:shd w:val="clear" w:color="auto" w:fill="F2F5FB"/>
-        <w:spacing w:after="120" w:line="276" w:lineRule="auto"/>
-        <w:ind w:left="567" w:right="567"/>
-        <w:jc w:val="both"/>
-      </w:pPr>
-      <w:r>
+        <w:jc w:val="both"/>
         <w:rPr>
           <w:i/>
           <w:iCs/>
         </w:rPr>
+      </w:pPr>
+      <w:r>
+        <w:rPr>
+          <w:i/>
+          <w:iCs/>
+        </w:rPr>
         <w:t>«Precisar cómo se verificarán la negativa documentada, el producto sanguíneo involucrado, los cambios de voluntad y las circunstancias de cualquier transfusión registrada».</w:t>
       </w:r>
     </w:p>
@@ -4420,15 +4251,7 @@
         <w:jc w:val="both"/>
       </w:pPr>
       <w:r>
-        <w:rPr>
-          <w:b/>
-          <w:bCs/>
-          <w:color w:val="C00000"/>
-        </w:rPr>
-        <w:t>Acogida</w:t>
-      </w:r>
-      <w:r>
-        <w:t xml:space="preserve">. Se agregó el procedimiento «Verificación de la documentación transfusional» (num. 3.5, </w:t>
+        <w:t xml:space="preserve">La observación fue acogida. Se agregó el procedimiento «Verificación de la documentación transfusional» (num. 3.5, </w:t>
       </w:r>
       <w:r>
         <w:rPr>
@@ -4483,12 +4306,6 @@
         <w:gridCol w:w="7206"/>
       </w:tblGrid>
       <w:tr>
-        <w:tblPrEx>
-          <w:tblCellMar>
-            <w:top w:w="0" w:type="dxa"/>
-            <w:bottom w:w="0" w:type="dxa"/>
-          </w:tblCellMar>
-        </w:tblPrEx>
         <w:trPr>
           <w:tblHeader/>
         </w:trPr>
@@ -4521,7 +4338,6 @@
                 <w:sz w:val="18"/>
                 <w:szCs w:val="18"/>
               </w:rPr>
-              <w:lastRenderedPageBreak/>
               <w:t>Elemento</w:t>
             </w:r>
           </w:p>
@@ -4561,12 +4377,6 @@
         </w:tc>
       </w:tr>
       <w:tr>
-        <w:tblPrEx>
-          <w:tblCellMar>
-            <w:top w:w="0" w:type="dxa"/>
-            <w:bottom w:w="0" w:type="dxa"/>
-          </w:tblCellMar>
-        </w:tblPrEx>
         <w:trPr>
           <w:cantSplit/>
         </w:trPr>
@@ -4630,12 +4440,6 @@
         </w:tc>
       </w:tr>
       <w:tr>
-        <w:tblPrEx>
-          <w:tblCellMar>
-            <w:top w:w="0" w:type="dxa"/>
-            <w:bottom w:w="0" w:type="dxa"/>
-          </w:tblCellMar>
-        </w:tblPrEx>
         <w:trPr>
           <w:cantSplit/>
         </w:trPr>
@@ -4693,18 +4497,12 @@
                 <w:sz w:val="18"/>
                 <w:szCs w:val="18"/>
               </w:rPr>
-              <w:t xml:space="preserve">Aceptación, rechazo o ausencia de registro, por separado: glóbulos rojos, plasma, plaquetas, crioprecipitado, glóbulos blancos, fracciones (albúmina, fibrinógeno, complejo protrombínico, factor VIIa, inmunoglobulinas), eritropoyetina y técnicas autólogas. Nunca se imputa desde la religión.</w:t>
+              <w:t>Aceptación, rechazo o ausencia de registro, por separado: glóbulos rojos, plasma, plaquetas, crioprecipitado, glóbulos blancos, fracciones (albúmina, fibrinógeno, complejo protrombínico, factor VIIa, inmunoglobulinas), eritropoyetina y técnicas autólogas. Nunca se imputa desde la religión.</w:t>
             </w:r>
           </w:p>
         </w:tc>
       </w:tr>
       <w:tr>
-        <w:tblPrEx>
-          <w:tblCellMar>
-            <w:top w:w="0" w:type="dxa"/>
-            <w:bottom w:w="0" w:type="dxa"/>
-          </w:tblCellMar>
-        </w:tblPrEx>
         <w:trPr>
           <w:cantSplit/>
         </w:trPr>
@@ -4768,12 +4566,6 @@
         </w:tc>
       </w:tr>
       <w:tr>
-        <w:tblPrEx>
-          <w:tblCellMar>
-            <w:top w:w="0" w:type="dxa"/>
-            <w:bottom w:w="0" w:type="dxa"/>
-          </w:tblCellMar>
-        </w:tblPrEx>
         <w:trPr>
           <w:cantSplit/>
         </w:trPr>
@@ -4885,8 +4677,14 @@
       <w:pPr>
         <w:pStyle w:val="Ttulo1"/>
         <w:keepNext/>
-      </w:pPr>
-      <w:r>
+        <w:rPr>
+          <w:color w:val="auto"/>
+        </w:rPr>
+      </w:pPr>
+      <w:r>
+        <w:rPr>
+          <w:color w:val="auto"/>
+        </w:rPr>
         <w:t>Compromisos del equipo investigador</w:t>
       </w:r>
     </w:p>
@@ -4961,6 +4759,7 @@
         <w:jc w:val="both"/>
       </w:pPr>
       <w:r>
+        <w:lastRenderedPageBreak/>
         <w:t>Cordialmente,</w:t>
       </w:r>
     </w:p>
@@ -4974,9 +4773,14 @@
       <w:pPr>
         <w:pStyle w:val="Ttulo1"/>
         <w:keepNext/>
-      </w:pPr>
-      <w:r>
-        <w:lastRenderedPageBreak/>
+        <w:rPr>
+          <w:color w:val="auto"/>
+        </w:rPr>
+      </w:pPr>
+      <w:r>
+        <w:rPr>
+          <w:color w:val="auto"/>
+        </w:rPr>
         <w:t>Declaración uso de IA:</w:t>
       </w:r>
     </w:p>
@@ -5026,7 +4830,7 @@
           <w:sz w:val="22"/>
           <w:szCs w:val="22"/>
         </w:rPr>
-        <w:t xml:space="preserve">ChatGPT (OpenAI) y Claude (Anthropic)</w:t>
+        <w:t>ChatGPT (OpenAI) y Claude (Anthropic)</w:t>
       </w:r>
       <w:r>
         <w:rPr>
@@ -5109,8 +4913,14 @@
       <w:pPr>
         <w:pStyle w:val="Ttulo1"/>
         <w:keepNext/>
-      </w:pPr>
-      <w:r>
+        <w:rPr>
+          <w:color w:val="auto"/>
+        </w:rPr>
+      </w:pPr>
+      <w:r>
+        <w:rPr>
+          <w:color w:val="auto"/>
+        </w:rPr>
         <w:t>Referencias citadas en esta respuesta</w:t>
       </w:r>
     </w:p>
@@ -5237,7 +5047,13 @@
         <w:jc w:val="both"/>
       </w:pPr>
       <w:r>
-        <w:t xml:space="preserve">National Commission for the Protection of Human Subjects. The Belmont Report. 1979.</w:t>
+        <w:rPr>
+          <w:lang w:val="en-US"/>
+        </w:rPr>
+        <w:t xml:space="preserve">National Commission for the Protection of Human Subjects. </w:t>
+      </w:r>
+      <w:r>
+        <w:t>The Belmont Report. 1979.</w:t>
       </w:r>
     </w:p>
     <w:p>
@@ -5249,9 +5065,15 @@
         </w:numPr>
         <w:spacing w:after="80" w:line="276" w:lineRule="auto"/>
         <w:jc w:val="both"/>
-      </w:pPr>
-      <w:r>
-        <w:t xml:space="preserve">International Committee of Medical Journal Editors (ICMJE). Recommendations for the conduct, reporting, editing, and publication of scholarly work in medical journals (protección de participantes).</w:t>
+        <w:rPr>
+          <w:lang w:val="en-US"/>
+        </w:rPr>
+      </w:pPr>
+      <w:r>
+        <w:rPr>
+          <w:lang w:val="en-US"/>
+        </w:rPr>
+        <w:t>International Committee of Medical Journal Editors (ICMJE). Recommendations for the conduct, reporting, editing, and publication of scholarly work in medical journals (protección de participantes).</w:t>
       </w:r>
     </w:p>
     <w:p>
@@ -5265,7 +5087,13 @@
         <w:jc w:val="both"/>
       </w:pPr>
       <w:r>
-        <w:t xml:space="preserve">Testigos de Jehová. Jehovah’s Witnesses: each Witness now decides whether to accept or donate main blood components [comunicado]. Septiembre de 2026. jw.org.</w:t>
+        <w:rPr>
+          <w:lang w:val="en-US"/>
+        </w:rPr>
+        <w:t xml:space="preserve">Testigos de Jehová. Jehovah’s Witnesses: each Witness now decides whether to accept or donate main blood components [comunicado]. </w:t>
+      </w:r>
+      <w:r>
+        <w:t>Septiembre de 2026. jw.org.</w:t>
       </w:r>
     </w:p>
     <w:p>
@@ -5279,7 +5107,13 @@
         <w:jc w:val="both"/>
       </w:pPr>
       <w:r>
-        <w:t xml:space="preserve">AABB. Jehovah’s Witnesses allow individual decisions on allogeneic blood transfusion and donation. AABB News, 21 de septiembre de 2026.</w:t>
+        <w:rPr>
+          <w:lang w:val="en-US"/>
+        </w:rPr>
+        <w:t xml:space="preserve">AABB. Jehovah’s Witnesses allow individual decisions on allogeneic blood transfusion and donation. </w:t>
+      </w:r>
+      <w:r>
+        <w:t>AABB News, 21 de septiembre de 2026.</w:t>
       </w:r>
     </w:p>
     <w:p>
@@ -5293,7 +5127,14 @@
         <w:jc w:val="both"/>
       </w:pPr>
       <w:r>
-        <w:t xml:space="preserve">Associated Press. Jehovah’s Witnesses ease policy on transfusions, allowing storage and use of one’s own blood. 20 de marzo de 2026.</w:t>
+        <w:rPr>
+          <w:lang w:val="en-US"/>
+        </w:rPr>
+        <w:lastRenderedPageBreak/>
+        <w:t xml:space="preserve">Associated Press. Jehovah’s Witnesses ease policy on transfusions, allowing storage and use of one’s own blood. </w:t>
+      </w:r>
+      <w:r>
+        <w:t>20 de marzo de 2026.</w:t>
       </w:r>
     </w:p>
     <w:p>
@@ -5307,7 +5148,13 @@
         <w:jc w:val="both"/>
       </w:pPr>
       <w:r>
-        <w:t xml:space="preserve">Pattakos G, et al. Outcome of patients who refuse transfusion after cardiac surgery: a natural experiment with severe blood conservation. Arch Intern Med. 2012;172(15):1154-60.</w:t>
+        <w:rPr>
+          <w:lang w:val="en-US"/>
+        </w:rPr>
+        <w:t xml:space="preserve">Pattakos G, et al. Outcome of patients who refuse transfusion after cardiac surgery: a natural experiment with severe blood conservation. </w:t>
+      </w:r>
+      <w:r>
+        <w:t>Arch Intern Med. 2012;172(15):1154-60.</w:t>
       </w:r>
     </w:p>
     <w:p>
@@ -5319,8 +5166,14 @@
         </w:numPr>
         <w:spacing w:after="80" w:line="276" w:lineRule="auto"/>
         <w:jc w:val="both"/>
-      </w:pPr>
-      <w:r>
+        <w:rPr>
+          <w:lang w:val="en-US"/>
+        </w:rPr>
+      </w:pPr>
+      <w:r>
+        <w:rPr>
+          <w:lang w:val="en-US"/>
+        </w:rPr>
         <w:t xml:space="preserve">Nakano HRY, et al. Coronary artery bypass grafting in Jehovah’s Witness patients: a retrospective propensity matched cohort study. Braz J Anesthesiol. 2026. doi:10.1016/j.bjane.2026.844765.</w:t>
       </w:r>
     </w:p>
@@ -5333,9 +5186,14 @@
         </w:numPr>
         <w:spacing w:after="80" w:line="276" w:lineRule="auto"/>
         <w:jc w:val="both"/>
-      </w:pPr>
-      <w:r>
-        <w:lastRenderedPageBreak/>
+        <w:rPr>
+          <w:lang w:val="en-US"/>
+        </w:rPr>
+      </w:pPr>
+      <w:r>
+        <w:rPr>
+          <w:lang w:val="en-US"/>
+        </w:rPr>
         <w:t xml:space="preserve">Hartrumpf M, et al. Everyday cardiac surgery in Jehovah’s Witnesses of typically advanced age: clinical outcome and matched comparison. J Clin Med. 2023;12(15):5110.</w:t>
       </w:r>
     </w:p>
@@ -5348,8 +5206,14 @@
         </w:numPr>
         <w:spacing w:after="80" w:line="276" w:lineRule="auto"/>
         <w:jc w:val="both"/>
-      </w:pPr>
-      <w:r>
+        <w:rPr>
+          <w:lang w:val="en-US"/>
+        </w:rPr>
+      </w:pPr>
+      <w:r>
+        <w:rPr>
+          <w:lang w:val="en-US"/>
+        </w:rPr>
         <w:t xml:space="preserve">Valle FH, et al. Cardiac surgery in Jehovah’s Witness patients: experience of a Brazilian tertiary hospital. Braz J Cardiovasc Surg. 2017;32(5):372-7.</w:t>
       </w:r>
     </w:p>
@@ -5362,8 +5226,14 @@
         </w:numPr>
         <w:spacing w:after="80" w:line="276" w:lineRule="auto"/>
         <w:jc w:val="both"/>
-      </w:pPr>
-      <w:r>
+        <w:rPr>
+          <w:lang w:val="en-US"/>
+        </w:rPr>
+      </w:pPr>
+      <w:r>
+        <w:rPr>
+          <w:lang w:val="en-US"/>
+        </w:rPr>
         <w:t xml:space="preserve">Tanaka A, et al. Cardiovascular surgery in Jehovah’s Witness patients: the role of preoperative optimization. J Thorac Cardiovasc Surg. 2015;150(4):976-83.</w:t>
       </w:r>
     </w:p>
@@ -5376,8 +5246,14 @@
         </w:numPr>
         <w:spacing w:after="80" w:line="276" w:lineRule="auto"/>
         <w:jc w:val="both"/>
-      </w:pPr>
-      <w:r>
+        <w:rPr>
+          <w:lang w:val="en-US"/>
+        </w:rPr>
+      </w:pPr>
+      <w:r>
+        <w:rPr>
+          <w:lang w:val="en-US"/>
+        </w:rPr>
         <w:t xml:space="preserve">Marinakis S, et al. Outcomes from cardiac surgery in Jehovah’s Witness patients: experience over twenty-one years. J Cardiothorac Surg. 2016. doi:10.1186/s13019-016-0455-6.</w:t>
       </w:r>
     </w:p>
@@ -5392,11 +5268,17 @@
         <w:jc w:val="both"/>
       </w:pPr>
       <w:r>
-        <w:t xml:space="preserve">Gemelli M, et al. Curr Probl Cardiol. 2024;49(1 Pt B):102078. Müller H, et al. Ann Thorac Surg. 2020;109(2):526-33. Jassar AS, et al. Ann Thorac Surg. 2012;93(1):19-25. Vitolo M, et al. Curr Probl Cardiol. 2023;48(9):101789. Langstraat M, et al. J Cardiothorac Vasc Anesth. 2023;37(9):1601-5. Helwani MA, et al. J Cardiothorac Vasc Anesth. 2023;37(4):513-8. Vaislic CD, et al. J Cardiothorac Surg. 2012;7:95. Yamabe T, et al. J Card Surg. 2025;2025:9190618. Montes Villalobos L, et al. Póster, Sociedad Colombiana de Cardiología.</w:t>
+        <w:rPr>
+          <w:lang w:val="en-US"/>
+        </w:rPr>
+        <w:t xml:space="preserve">Gemelli M, et al. Curr Probl Cardiol. 2024;49(1 Pt B):102078. Müller H, et al. Ann Thorac Surg. 2020;109(2):526-33. </w:t>
+      </w:r>
+      <w:r>
+        <w:t>Jassar AS, et al. Ann Thorac Surg. 2012;93(1):19-25. Vitolo M, et al. Curr Probl Cardiol. 2023;48(9):101789. Langstraat M, et al. J Cardiothorac Vasc Anesth. 2023;37(9):1601-5. Helwani MA, et al. J Cardiothorac Vasc Anesth. 2023;37(4):513-8. Vaislic CD, et al. J Cardiothorac Surg. 2012;7:95. Yamabe T, et al. J Card Surg. 2025;2025:9190618. Montes Villalobos L, et al. Póster, Sociedad Colombiana de Cardiología.</w:t>
       </w:r>
     </w:p>
     <w:sectPr>
-      <w:footerReference w:type="default" r:id="rId7"/>
+      <w:footerReference w:type="default" r:id="rId8"/>
       <w:pgSz w:w="12240" w:h="15840"/>
       <w:pgMar w:top="1417" w:right="1417" w:bottom="1417" w:left="1417" w:header="708" w:footer="708" w:gutter="0"/>
       <w:cols w:space="720"/>
@@ -6336,7 +6218,6 @@
   <w:style w:type="character" w:default="1" w:styleId="Fuentedeprrafopredeter">
     <w:name w:val="Default Paragraph Font"/>
     <w:uiPriority w:val="1"/>
-    <w:semiHidden/>
     <w:unhideWhenUsed/>
   </w:style>
   <w:style w:type="table" w:default="1" w:styleId="Tablanormal">
@@ -6821,4 +6702,16 @@
     </a:ext>
   </a:extLst>
 </a:theme>
+</file>
+
+<file path=customXml/item1.xml><?xml version="1.0" encoding="utf-8"?>
+<b:Sources xmlns:b="http://schemas.openxmlformats.org/officeDocument/2006/bibliography" xmlns="http://schemas.openxmlformats.org/officeDocument/2006/bibliography" SelectedStyle="\APASixthEditionOfficeOnline.xsl" StyleName="APA" Version="6"/>
+</file>
+
+<file path=customXml/itemProps1.xml><?xml version="1.0" encoding="utf-8"?>
+<ds:datastoreItem xmlns:ds="http://schemas.openxmlformats.org/officeDocument/2006/customXml" ds:itemID="{60DEBC10-944B-4F46-A75C-1FB66223A565}">
+  <ds:schemaRefs>
+    <ds:schemaRef ds:uri="http://schemas.openxmlformats.org/officeDocument/2006/bibliography"/>
+  </ds:schemaRefs>
+</ds:datastoreItem>
 </file>
</xml_diff>